<commit_message>
Complete NASA forecasting assignment reports
</commit_message>
<xml_diff>
--- a/NASA_Solar_Irradiance_Report.docx
+++ b/NASA_Solar_Irradiance_Report.docx
@@ -686,7 +686,7 @@
           <w:i w:val="0"/>
           <w:sz w:val="18"/>
         </w:rPr>
-        <w:t>This study forecasts monthly all-sky surface shortwave downward irradiance for Kuala Lumpur using 300 NASA POWER observations from 2001-01 to 2025-12. Four course-aligned models and a seasonal-naive benchmark were evaluated on 2024-2025. SARIMA achieved the lowest RMSE (0.201 kWh/m2/day), MAE (0.162) and MAPE (3.51%). Its residual Ljung-Box p-value was 0.223. The 2026 forecast preserves pronounced seasonal resource variation. The results can support preliminary solar planning but do not represent site-specific generation or climate-change attribution.</w:t>
+        <w:t>This study forecasts monthly all-sky surface shortwave downward irradiance for Kuala Lumpur using 300 NASA POWER observations from 2001-01 to 2025-12. Four course-aligned models were evaluated on 2024-2025. SARIMA achieved the lowest RMSE (0.201 kWh/m2/day), MAE (0.162) and MAPE (3.51%). Its residual Ljung-Box p-value was 0.223. The 2026 forecast preserves pronounced seasonal resource variation. The results can support preliminary solar planning but do not represent site-specific generation or climate-change attribution.</w:t>
       </w:r>
     </w:p>
     <w:p>
@@ -956,7 +956,7 @@
           <w:i w:val="0"/>
           <w:sz w:val="18"/>
         </w:rPr>
-        <w:t>January 2001-December 2023 formed the training set; January 2024-December 2025 was an untouched 24-month test. Member assignments are trend-plus-season regression, additive Holt-Winters, ETS, and SARIMA. Seasonal naive is shared. Accuracy is assessed with MAE, RMSE, MAPE, MASE and sMAPE, followed by residual ACF and Ljung-Box diagnostics.</w:t>
+        <w:t>January 2001-December 2023 formed the training set; January 2024-December 2025 was an untouched 24-month test. Member assignments are trend-plus-season regression, additive Holt-Winters, ETS, and SARIMA. Accuracy is assessed with MAE, RMSE, MAPE, MASE and sMAPE, followed by residual ACF and Ljung-Box diagnostics.</w:t>
       </w:r>
     </w:p>
     <w:p>
@@ -1402,7 +1402,7 @@
                 <w:i w:val="0"/>
                 <w:sz w:val="12"/>
               </w:rPr>
-              <w:t>0.306</w:t>
+              <w:t>0.305</w:t>
             </w:r>
           </w:p>
         </w:tc>
@@ -1631,108 +1631,6 @@
           </w:p>
         </w:tc>
       </w:tr>
-      <w:tr>
-        <w:tc>
-          <w:tcPr>
-            <w:tcW w:type="dxa" w:w="1526"/>
-          </w:tcPr>
-          <w:p>
-            <w:pPr>
-              <w:spacing w:after="0"/>
-              <w:jc w:val="left"/>
-            </w:pPr>
-            <w:r>
-              <w:rPr>
-                <w:rFonts w:ascii="Times New Roman" w:hAnsi="Times New Roman"/>
-                <w:b w:val="0"/>
-                <w:i w:val="0"/>
-                <w:sz w:val="12"/>
-              </w:rPr>
-              <w:t>Seasonal naive</w:t>
-            </w:r>
-          </w:p>
-        </w:tc>
-        <w:tc>
-          <w:tcPr>
-            <w:tcW w:type="dxa" w:w="749"/>
-          </w:tcPr>
-          <w:p>
-            <w:pPr>
-              <w:spacing w:after="0"/>
-              <w:jc w:val="center"/>
-            </w:pPr>
-            <w:r>
-              <w:rPr>
-                <w:rFonts w:ascii="Times New Roman" w:hAnsi="Times New Roman"/>
-                <w:b w:val="0"/>
-                <w:i w:val="0"/>
-                <w:sz w:val="12"/>
-              </w:rPr>
-              <w:t>0.300</w:t>
-            </w:r>
-          </w:p>
-        </w:tc>
-        <w:tc>
-          <w:tcPr>
-            <w:tcW w:type="dxa" w:w="749"/>
-          </w:tcPr>
-          <w:p>
-            <w:pPr>
-              <w:spacing w:after="0"/>
-              <w:jc w:val="center"/>
-            </w:pPr>
-            <w:r>
-              <w:rPr>
-                <w:rFonts w:ascii="Times New Roman" w:hAnsi="Times New Roman"/>
-                <w:b w:val="0"/>
-                <w:i w:val="0"/>
-                <w:sz w:val="12"/>
-              </w:rPr>
-              <w:t>0.232</w:t>
-            </w:r>
-          </w:p>
-        </w:tc>
-        <w:tc>
-          <w:tcPr>
-            <w:tcW w:type="dxa" w:w="806"/>
-          </w:tcPr>
-          <w:p>
-            <w:pPr>
-              <w:spacing w:after="0"/>
-              <w:jc w:val="center"/>
-            </w:pPr>
-            <w:r>
-              <w:rPr>
-                <w:rFonts w:ascii="Times New Roman" w:hAnsi="Times New Roman"/>
-                <w:b w:val="0"/>
-                <w:i w:val="0"/>
-                <w:sz w:val="12"/>
-              </w:rPr>
-              <w:t>0.403</w:t>
-            </w:r>
-          </w:p>
-        </w:tc>
-        <w:tc>
-          <w:tcPr>
-            <w:tcW w:type="dxa" w:w="806"/>
-          </w:tcPr>
-          <w:p>
-            <w:pPr>
-              <w:spacing w:after="0"/>
-              <w:jc w:val="center"/>
-            </w:pPr>
-            <w:r>
-              <w:rPr>
-                <w:rFonts w:ascii="Times New Roman" w:hAnsi="Times New Roman"/>
-                <w:b w:val="0"/>
-                <w:i w:val="0"/>
-                <w:sz w:val="12"/>
-              </w:rPr>
-              <w:t>0.287</w:t>
-            </w:r>
-          </w:p>
-        </w:tc>
-      </w:tr>
     </w:tbl>
     <w:p>
       <w:pPr>
@@ -1761,7 +1659,7 @@
           <w:i w:val="0"/>
           <w:sz w:val="18"/>
         </w:rPr>
-        <w:t>SARIMA ranked first with RMSE 0.201, MAE 0.162, MAPE 3.51% and MASE 0.539. Its training RMSE was 0.309 versus test RMSE 0.201. Holt-Winters was close behind on the test set with RMSE 0.211. Training figures are in-sample residual errors, while test figures measure forecasts for unseen months; model selection therefore uses test RMSE. Seasonal naive had test RMSE 0.287, indicating that modelling dependence beyond a fixed annual repeat improved accuracy.</w:t>
+        <w:t>SARIMA ranked first with RMSE 0.201, MAE 0.162, MAPE 3.51% and MASE 0.539. Its training RMSE was 0.309 versus test RMSE 0.201. Holt-Winters was close behind on the test set with RMSE 0.211. Training figures are in-sample residual errors, while test figures measure forecasts for unseen months; model selection therefore uses test RMSE.</w:t>
       </w:r>
     </w:p>
     <w:p>
@@ -1793,7 +1691,7 @@
           <w:i w:val="0"/>
           <w:sz w:val="18"/>
         </w:rPr>
-        <w:t>The selected SARIMA specification was ARIMA(1,0,0)(2,1,0)[12]. Its Ljung-Box statistic was 28.92 with p = 0.223, providing no evidence of residual autocorrelation at lag 24. The seasonal-naive residuals remained strongly autocorrelated.</w:t>
+        <w:t>The selected SARIMA specification was ARIMA(1,0,0)(2,1,0)[12]. Its Ljung-Box statistic was 28.92 with p = 0.223, providing no evidence of residual autocorrelation at lag 24.</w:t>
       </w:r>
     </w:p>
     <w:p>

</xml_diff>